<commit_message>
RAC 11~17·20장 docx 의 백틱을 Consolas 서식으로 정리
- docx 24개에 글자로 남아 있던 백틱 3,392개를 코드 서식 run 으로 변환
- 빌드 뒤 손본 내용을 보존하려고 재빌드 대신 기존 docx 를 후처리
- 백틱을 뺀 본문 텍스트는 이전 커밋과 동일, verify_ch 21항목 통과
- 제작_가이드: RAC 행 갱신

Co-Authored-By: Claude Opus 5.5 <noreply@anthropic.com>
</commit_message>
<xml_diff>
--- a/RAC/11장/11장_RAC데이터베이스생성.docx
+++ b/RAC/11장/11장_RAC데이터베이스생성.docx
@@ -1460,19 +1460,61 @@
     <w:p>
       <w:r>
         <w:rPr>
+          <w:rFonts w:ascii="Consolas" w:hAnsi="Consolas" w:eastAsia="Consolas" w:cs="Consolas"/>
+          <w:sz w:val="20"/>
+        </w:rPr>
+        <w:t xml:space="preserve">-databaseConfigType RAC</w:t>
+      </w:r>
+      <w:r>
+        <w:rPr>
           <w:rFonts w:ascii="맑은 고딕" w:hAnsi="맑은 고딕" w:eastAsia="맑은 고딕"/>
           <w:sz w:val="21"/>
         </w:rPr>
-        <w:t>`-databaseConfigType RAC` 이 없으면 단일 인스턴스가 만들어진다. `-nodelist` 가 노드를 둘 이상 받아야 인스턴스도 둘이 된다.</w:t>
+        <w:t xml:space="preserve"> 이 없으면 단일 인스턴스가 만들어진다. </w:t>
+      </w:r>
+      <w:r>
+        <w:rPr>
+          <w:rFonts w:ascii="Consolas" w:hAnsi="Consolas" w:eastAsia="Consolas" w:cs="Consolas"/>
+          <w:sz w:val="20"/>
+        </w:rPr>
+        <w:t xml:space="preserve">-nodelist</w:t>
+      </w:r>
+      <w:r>
+        <w:rPr>
+          <w:rFonts w:ascii="맑은 고딕" w:hAnsi="맑은 고딕" w:eastAsia="맑은 고딕"/>
+          <w:sz w:val="21"/>
+        </w:rPr>
+        <w:t xml:space="preserve"> 가 노드를 둘 이상 받아야 인스턴스도 둘이 된다.</w:t>
       </w:r>
     </w:p>
     <w:p>
       <w:r>
         <w:rPr>
+          <w:rFonts w:ascii="Consolas" w:hAnsi="Consolas" w:eastAsia="Consolas" w:cs="Consolas"/>
+          <w:sz w:val="20"/>
+        </w:rPr>
+        <w:t xml:space="preserve">-adminManaged</w:t>
+      </w:r>
+      <w:r>
+        <w:rPr>
           <w:rFonts w:ascii="맑은 고딕" w:hAnsi="맑은 고딕" w:eastAsia="맑은 고딕"/>
           <w:sz w:val="21"/>
         </w:rPr>
-        <w:t>`-adminManaged` 는 관리자가 인스턴스와 노드의 대응을 직접 정하는 방식이다. 반대인 `-policyManaged` 는 서버 풀에 맡긴다. 2 노드 환경에서는 관리자 관리가 단순하다.</w:t>
+        <w:t xml:space="preserve"> 는 관리자가 인스턴스와 노드의 대응을 직접 정하는 방식이다. 반대인 </w:t>
+      </w:r>
+      <w:r>
+        <w:rPr>
+          <w:rFonts w:ascii="Consolas" w:hAnsi="Consolas" w:eastAsia="Consolas" w:cs="Consolas"/>
+          <w:sz w:val="20"/>
+        </w:rPr>
+        <w:t xml:space="preserve">-policyManaged</w:t>
+      </w:r>
+      <w:r>
+        <w:rPr>
+          <w:rFonts w:ascii="맑은 고딕" w:hAnsi="맑은 고딕" w:eastAsia="맑은 고딕"/>
+          <w:sz w:val="21"/>
+        </w:rPr>
+        <w:t xml:space="preserve"> 는 서버 풀에 맡긴다. 2 노드 환경에서는 관리자 관리가 단순하다.</w:t>
       </w:r>
     </w:p>
     <w:p>
@@ -1591,7 +1633,35 @@
           <w:rFonts w:ascii="맑은 고딕" w:hAnsi="맑은 고딕" w:eastAsia="맑은 고딕"/>
           <w:sz w:val="21"/>
         </w:rPr>
-        <w:t>DBT-06007 이다. 같은 명령에서 `-diskGroupName DATA` 는 + 없이 통과했는데 `-recoveryAreaDestination` 은 실패했다.</w:t>
+        <w:t xml:space="preserve">DBT-06007 이다. 같은 명령에서 </w:t>
+      </w:r>
+      <w:r>
+        <w:rPr>
+          <w:rFonts w:ascii="Consolas" w:hAnsi="Consolas" w:eastAsia="Consolas" w:cs="Consolas"/>
+          <w:sz w:val="20"/>
+        </w:rPr>
+        <w:t xml:space="preserve">-diskGroupName DATA</w:t>
+      </w:r>
+      <w:r>
+        <w:rPr>
+          <w:rFonts w:ascii="맑은 고딕" w:hAnsi="맑은 고딕" w:eastAsia="맑은 고딕"/>
+          <w:sz w:val="21"/>
+        </w:rPr>
+        <w:t xml:space="preserve"> 는 + 없이 통과했는데 </w:t>
+      </w:r>
+      <w:r>
+        <w:rPr>
+          <w:rFonts w:ascii="Consolas" w:hAnsi="Consolas" w:eastAsia="Consolas" w:cs="Consolas"/>
+          <w:sz w:val="20"/>
+        </w:rPr>
+        <w:t xml:space="preserve">-recoveryAreaDestination</w:t>
+      </w:r>
+      <w:r>
+        <w:rPr>
+          <w:rFonts w:ascii="맑은 고딕" w:hAnsi="맑은 고딕" w:eastAsia="맑은 고딕"/>
+          <w:sz w:val="21"/>
+        </w:rPr>
+        <w:t xml:space="preserve"> 은 실패했다.</w:t>
       </w:r>
     </w:p>
     <w:p>
@@ -1687,31 +1757,115 @@
                 <w:rFonts w:ascii="맑은 고딕" w:hAnsi="맑은 고딕" w:eastAsia="맑은 고딕"/>
                 <w:sz w:val="20"/>
               </w:rPr>
-              <w:t>확인해 보면 `dbca -silent -createDatabase -help` 에 `-diskGroupName` 이라는 문자열이 아예 없다. `-storageType` 아래에 문서화된 인자는 `-datafileDestination` 이다.</w:t>
-            </w:r>
-          </w:p>
-          <w:p>
-            <w:pPr>
-              <w:spacing w:after="20"/>
-            </w:pPr>
+              <w:t xml:space="preserve">확인해 보면 </w:t>
+            </w:r>
+            <w:r>
+              <w:rPr>
+                <w:rFonts w:ascii="Consolas" w:hAnsi="Consolas" w:eastAsia="Consolas" w:cs="Consolas"/>
+                <w:sz w:val="19"/>
+              </w:rPr>
+              <w:t xml:space="preserve">dbca -silent -createDatabase -help</w:t>
+            </w:r>
             <w:r>
               <w:rPr>
                 <w:rFonts w:ascii="맑은 고딕" w:hAnsi="맑은 고딕" w:eastAsia="맑은 고딕"/>
                 <w:sz w:val="20"/>
               </w:rPr>
-              <w:t>그런데 실습에서 `-diskGroupName DATA` 로 실행했고 데이터파일이 +DATA/TESTDB 아래에 만들어졌다. 도움말에 없는 인자가 동작한 것이다.</w:t>
-            </w:r>
-          </w:p>
-          <w:p>
-            <w:pPr>
-              <w:spacing w:after="20"/>
-            </w:pPr>
+              <w:t xml:space="preserve"> 에 </w:t>
+            </w:r>
+            <w:r>
+              <w:rPr>
+                <w:rFonts w:ascii="Consolas" w:hAnsi="Consolas" w:eastAsia="Consolas" w:cs="Consolas"/>
+                <w:sz w:val="19"/>
+              </w:rPr>
+              <w:t xml:space="preserve">-diskGroupName</w:t>
+            </w:r>
             <w:r>
               <w:rPr>
                 <w:rFonts w:ascii="맑은 고딕" w:hAnsi="맑은 고딕" w:eastAsia="맑은 고딕"/>
                 <w:sz w:val="20"/>
               </w:rPr>
-              <w:t>안전한 선택은 문서화된 형태를 쓰는 것이다. `-datafileDestination '+DATA'` 로 쓰면 도움말과 일치하며, 이때는 경로이므로 + 가 필요하다.</w:t>
+              <w:t xml:space="preserve"> 이라는 문자열이 아예 없다. </w:t>
+            </w:r>
+            <w:r>
+              <w:rPr>
+                <w:rFonts w:ascii="Consolas" w:hAnsi="Consolas" w:eastAsia="Consolas" w:cs="Consolas"/>
+                <w:sz w:val="19"/>
+              </w:rPr>
+              <w:t xml:space="preserve">-storageType</w:t>
+            </w:r>
+            <w:r>
+              <w:rPr>
+                <w:rFonts w:ascii="맑은 고딕" w:hAnsi="맑은 고딕" w:eastAsia="맑은 고딕"/>
+                <w:sz w:val="20"/>
+              </w:rPr>
+              <w:t xml:space="preserve"> 아래에 문서화된 인자는 </w:t>
+            </w:r>
+            <w:r>
+              <w:rPr>
+                <w:rFonts w:ascii="Consolas" w:hAnsi="Consolas" w:eastAsia="Consolas" w:cs="Consolas"/>
+                <w:sz w:val="19"/>
+              </w:rPr>
+              <w:t xml:space="preserve">-datafileDestination</w:t>
+            </w:r>
+            <w:r>
+              <w:rPr>
+                <w:rFonts w:ascii="맑은 고딕" w:hAnsi="맑은 고딕" w:eastAsia="맑은 고딕"/>
+                <w:sz w:val="20"/>
+              </w:rPr>
+              <w:t xml:space="preserve"> 이다.</w:t>
+            </w:r>
+          </w:p>
+          <w:p>
+            <w:pPr>
+              <w:spacing w:after="20"/>
+            </w:pPr>
+            <w:r>
+              <w:rPr>
+                <w:rFonts w:ascii="맑은 고딕" w:hAnsi="맑은 고딕" w:eastAsia="맑은 고딕"/>
+                <w:sz w:val="20"/>
+              </w:rPr>
+              <w:t xml:space="preserve">그런데 실습에서 </w:t>
+            </w:r>
+            <w:r>
+              <w:rPr>
+                <w:rFonts w:ascii="Consolas" w:hAnsi="Consolas" w:eastAsia="Consolas" w:cs="Consolas"/>
+                <w:sz w:val="19"/>
+              </w:rPr>
+              <w:t xml:space="preserve">-diskGroupName DATA</w:t>
+            </w:r>
+            <w:r>
+              <w:rPr>
+                <w:rFonts w:ascii="맑은 고딕" w:hAnsi="맑은 고딕" w:eastAsia="맑은 고딕"/>
+                <w:sz w:val="20"/>
+              </w:rPr>
+              <w:t xml:space="preserve"> 로 실행했고 데이터파일이 +DATA/TESTDB 아래에 만들어졌다. 도움말에 없는 인자가 동작한 것이다.</w:t>
+            </w:r>
+          </w:p>
+          <w:p>
+            <w:pPr>
+              <w:spacing w:after="20"/>
+            </w:pPr>
+            <w:r>
+              <w:rPr>
+                <w:rFonts w:ascii="맑은 고딕" w:hAnsi="맑은 고딕" w:eastAsia="맑은 고딕"/>
+                <w:sz w:val="20"/>
+              </w:rPr>
+              <w:t xml:space="preserve">안전한 선택은 문서화된 형태를 쓰는 것이다. </w:t>
+            </w:r>
+            <w:r>
+              <w:rPr>
+                <w:rFonts w:ascii="Consolas" w:hAnsi="Consolas" w:eastAsia="Consolas" w:cs="Consolas"/>
+                <w:sz w:val="19"/>
+              </w:rPr>
+              <w:t xml:space="preserve">-datafileDestination '+DATA'</w:t>
+            </w:r>
+            <w:r>
+              <w:rPr>
+                <w:rFonts w:ascii="맑은 고딕" w:hAnsi="맑은 고딕" w:eastAsia="맑은 고딕"/>
+                <w:sz w:val="20"/>
+              </w:rPr>
+              <w:t xml:space="preserve"> 로 쓰면 도움말과 일치하며, 이때는 경로이므로 + 가 필요하다.</w:t>
             </w:r>
           </w:p>
           <w:p>
@@ -2817,28 +2971,63 @@
     <w:p>
       <w:r>
         <w:rPr>
+          <w:rFonts w:ascii="Consolas" w:hAnsi="Consolas" w:eastAsia="Consolas" w:cs="Consolas"/>
+          <w:sz w:val="20"/>
+        </w:rPr>
+        <w:t xml:space="preserve">-totalMemory 800</w:t>
+      </w:r>
+      <w:r>
+        <w:rPr>
           <w:rFonts w:ascii="맑은 고딕" w:hAnsi="맑은 고딕" w:eastAsia="맑은 고딕"/>
           <w:sz w:val="21"/>
         </w:rPr>
-        <w:t>`-totalMemory 800` 은 작다. 운영에서는 이렇게 쓰지 않는다. 이 랩의 노드 메모리가 8.6GB 이고 racdb 가 이미 상당 부분을 쓰고 있어 새 데이터베이스에 줄 여유가 크지 않기 때문이다.</w:t>
+        <w:t xml:space="preserve"> 은 작다. 운영에서는 이렇게 쓰지 않는다. 이 랩의 노드 메모리가 8.6GB 이고 racdb 가 이미 상당 부분을 쓰고 있어 새 데이터베이스에 줄 여유가 크지 않기 때문이다.</w:t>
       </w:r>
     </w:p>
     <w:p>
       <w:r>
         <w:rPr>
+          <w:rFonts w:ascii="Consolas" w:hAnsi="Consolas" w:eastAsia="Consolas" w:cs="Consolas"/>
+          <w:sz w:val="20"/>
+        </w:rPr>
+        <w:t xml:space="preserve">-redoLogFileSize 20</w:t>
+      </w:r>
+      <w:r>
+        <w:rPr>
           <w:rFonts w:ascii="맑은 고딕" w:hAnsi="맑은 고딕" w:eastAsia="맑은 고딕"/>
           <w:sz w:val="21"/>
         </w:rPr>
-        <w:t>`-redoLogFileSize 20` 도 작다. 기본값은 200MB 인데 20MB 로 줄여 생성 시간과 공간을 아꼈다.</w:t>
+        <w:t xml:space="preserve"> 도 작다. 기본값은 200MB 인데 20MB 로 줄여 생성 시간과 공간을 아꼈다.</w:t>
       </w:r>
     </w:p>
     <w:p>
       <w:r>
         <w:rPr>
+          <w:rFonts w:ascii="Consolas" w:hAnsi="Consolas" w:eastAsia="Consolas" w:cs="Consolas"/>
+          <w:sz w:val="20"/>
+        </w:rPr>
+        <w:t xml:space="preserve">-emConfiguration NONE</w:t>
+      </w:r>
+      <w:r>
+        <w:rPr>
           <w:rFonts w:ascii="맑은 고딕" w:hAnsi="맑은 고딕" w:eastAsia="맑은 고딕"/>
           <w:sz w:val="21"/>
         </w:rPr>
-        <w:t>`-emConfiguration NONE` 과 `-sampleSchema false` 는 생성 시간을 줄이려는 것이다. EM Express 구성과 샘플 스키마는 이 장의 학습 목표와 무관하다.</w:t>
+        <w:t xml:space="preserve"> 과 </w:t>
+      </w:r>
+      <w:r>
+        <w:rPr>
+          <w:rFonts w:ascii="Consolas" w:hAnsi="Consolas" w:eastAsia="Consolas" w:cs="Consolas"/>
+          <w:sz w:val="20"/>
+        </w:rPr>
+        <w:t xml:space="preserve">-sampleSchema false</w:t>
+      </w:r>
+      <w:r>
+        <w:rPr>
+          <w:rFonts w:ascii="맑은 고딕" w:hAnsi="맑은 고딕" w:eastAsia="맑은 고딕"/>
+          <w:sz w:val="21"/>
+        </w:rPr>
+        <w:t xml:space="preserve"> 는 생성 시간을 줄이려는 것이다. EM Express 구성과 샘플 스키마는 이 장의 학습 목표와 무관하다.</w:t>
       </w:r>
     </w:p>
     <w:p>
@@ -3149,28 +3338,49 @@
     <w:p>
       <w:r>
         <w:rPr>
+          <w:rFonts w:ascii="Consolas" w:hAnsi="Consolas" w:eastAsia="Consolas" w:cs="Consolas"/>
+          <w:sz w:val="20"/>
+        </w:rPr>
+        <w:t xml:space="preserve">Copying database files</w:t>
+      </w:r>
+      <w:r>
+        <w:rPr>
           <w:rFonts w:ascii="맑은 고딕" w:hAnsi="맑은 고딕" w:eastAsia="맑은 고딕"/>
           <w:sz w:val="21"/>
         </w:rPr>
-        <w:t>`Copying database files` 가 가장 길다. 씨앗 데이터베이스의 데이터파일을 +DATA 로 복사하는 단계이며 I/O 가 집중된다.</w:t>
+        <w:t xml:space="preserve"> 가 가장 길다. 씨앗 데이터베이스의 데이터파일을 +DATA 로 복사하는 단계이며 I/O 가 집중된다.</w:t>
       </w:r>
     </w:p>
     <w:p>
       <w:r>
         <w:rPr>
+          <w:rFonts w:ascii="Consolas" w:hAnsi="Consolas" w:eastAsia="Consolas" w:cs="Consolas"/>
+          <w:sz w:val="20"/>
+        </w:rPr>
+        <w:t xml:space="preserve">Creating cluster database views</w:t>
+      </w:r>
+      <w:r>
+        <w:rPr>
           <w:rFonts w:ascii="맑은 고딕" w:hAnsi="맑은 고딕" w:eastAsia="맑은 고딕"/>
           <w:sz w:val="21"/>
         </w:rPr>
-        <w:t>`Creating cluster database views` 가 RAC 전용 단계다. GV$ 계열 뷰를 만든다. 단일 인스턴스 생성에는 없다.</w:t>
+        <w:t xml:space="preserve"> 가 RAC 전용 단계다. GV$ 계열 뷰를 만든다. 단일 인스턴스 생성에는 없다.</w:t>
       </w:r>
     </w:p>
     <w:p>
       <w:r>
         <w:rPr>
+          <w:rFonts w:ascii="Consolas" w:hAnsi="Consolas" w:eastAsia="Consolas" w:cs="Consolas"/>
+          <w:sz w:val="20"/>
+        </w:rPr>
+        <w:t xml:space="preserve">Creating Pluggable Databases</w:t>
+      </w:r>
+      <w:r>
+        <w:rPr>
           <w:rFonts w:ascii="맑은 고딕" w:hAnsi="맑은 고딕" w:eastAsia="맑은 고딕"/>
           <w:sz w:val="21"/>
         </w:rPr>
-        <w:t>`Creating Pluggable Databases` 는 씨앗 PDB 를 복사해 testpdb 를 만든다.</w:t>
+        <w:t xml:space="preserve"> 는 씨앗 PDB 를 복사해 testpdb 를 만든다.</w:t>
       </w:r>
     </w:p>
     <w:tbl>
@@ -3487,10 +3697,17 @@
     <w:p>
       <w:r>
         <w:rPr>
+          <w:rFonts w:ascii="Consolas" w:hAnsi="Consolas" w:eastAsia="Consolas" w:cs="Consolas"/>
+          <w:sz w:val="20"/>
+        </w:rPr>
+        <w:t xml:space="preserve">PDBCreation.log</w:t>
+      </w:r>
+      <w:r>
+        <w:rPr>
           <w:rFonts w:ascii="맑은 고딕" w:hAnsi="맑은 고딕" w:eastAsia="맑은 고딕"/>
           <w:sz w:val="21"/>
         </w:rPr>
-        <w:t>`PDBCreation.log` 처럼 단계 이름이 파일명에 드러나므로 어디서 실패했는지 찾기 쉽다.</w:t>
+        <w:t xml:space="preserve"> 처럼 단계 이름이 파일명에 드러나므로 어디서 실패했는지 찾기 쉽다.</w:t>
       </w:r>
     </w:p>
     <w:p>
@@ -6781,7 +6998,21 @@
           <w:rFonts w:ascii="맑은 고딕" w:hAnsi="맑은 고딕" w:eastAsia="맑은 고딕"/>
           <w:sz w:val="21"/>
         </w:rPr>
-        <w:t>둘 다 `instances=all` 을 붙였다. 12장에서 다룬 대로 저장 상태도 인스턴스별로 기록되기 때문이다.</w:t>
+        <w:t xml:space="preserve">둘 다 </w:t>
+      </w:r>
+      <w:r>
+        <w:rPr>
+          <w:rFonts w:ascii="Consolas" w:hAnsi="Consolas" w:eastAsia="Consolas" w:cs="Consolas"/>
+          <w:sz w:val="20"/>
+        </w:rPr>
+        <w:t xml:space="preserve">instances=all</w:t>
+      </w:r>
+      <w:r>
+        <w:rPr>
+          <w:rFonts w:ascii="맑은 고딕" w:hAnsi="맑은 고딕" w:eastAsia="맑은 고딕"/>
+          <w:sz w:val="21"/>
+        </w:rPr>
+        <w:t xml:space="preserve"> 을 붙였다. 12장에서 다룬 대로 저장 상태도 인스턴스별로 기록되기 때문이다.</w:t>
       </w:r>
     </w:p>
     <w:p>

</xml_diff>